<commit_message>
Updated setup documentation and read me
</commit_message>
<xml_diff>
--- a/docs/Observatory_Setup_Guide.docx
+++ b/docs/Observatory_Setup_Guide.docx
@@ -247,6 +247,257 @@
       </w:r>
       <w:r>
         <w:t xml:space="preserve"> — records every safety-relevant change (sensor connect/disconnect, check flips, overall SAFE/UNSAFE, dome/heater actions, manual overrides), optionally attaching an All Sky snapshot per event type.</w:t>
+      </w:r>
+    </w:p>
+    <w:p>
+      <w:pPr>
+        <w:pStyle w:val="Heading1"/>
+        <w:pBdr>
+          <w:bottom w:val="single" w:color="1F3A5F" w:sz="6" w:space="4"/>
+        </w:pBdr>
+        <w:spacing w:after="200" w:before="480"/>
+      </w:pPr>
+      <w:r>
+        <w:rPr>
+          <w:b/>
+          <w:bCs/>
+          <w:color w:val="1F3A5F"/>
+        </w:rPr>
+        <w:t xml:space="preserve">Rebuild From Scratch — Checklist</w:t>
+      </w:r>
+    </w:p>
+    <w:p>
+      <w:pPr>
+        <w:spacing w:after="160" w:line="300"/>
+      </w:pPr>
+      <w:r>
+        <w:t xml:space="preserve">Follow these in order to rebuild the whole system on a fresh Raspberry Pi. Each item points to the section with the details.</w:t>
+      </w:r>
+    </w:p>
+    <w:p>
+      <w:pPr>
+        <w:pStyle w:val="ListParagraph"/>
+        <w:numPr>
+          <w:ilvl w:val="0"/>
+          <w:numId w:val="2"/>
+        </w:numPr>
+        <w:spacing w:after="100" w:line="280"/>
+      </w:pPr>
+      <w:r>
+        <w:rPr>
+          <w:b/>
+          <w:bCs/>
+        </w:rPr>
+        <w:t xml:space="preserve">Raspberry Pi OS with Python 3.12 or newer</w:t>
+      </w:r>
+      <w:r>
+        <w:t xml:space="preserve"> — the Trixie-based release (Python 3.13). See 2.2.</w:t>
+      </w:r>
+    </w:p>
+    <w:p>
+      <w:pPr>
+        <w:pStyle w:val="ListParagraph"/>
+        <w:numPr>
+          <w:ilvl w:val="0"/>
+          <w:numId w:val="2"/>
+        </w:numPr>
+        <w:spacing w:after="100" w:line="280"/>
+      </w:pPr>
+      <w:r>
+        <w:rPr>
+          <w:b/>
+          <w:bCs/>
+        </w:rPr>
+        <w:t xml:space="preserve">Wire the hardware</w:t>
+      </w:r>
+      <w:r>
+        <w:t xml:space="preserve"> to the default pins (2.1) and enable I2C (Step 1).</w:t>
+      </w:r>
+    </w:p>
+    <w:p>
+      <w:pPr>
+        <w:pStyle w:val="ListParagraph"/>
+        <w:numPr>
+          <w:ilvl w:val="0"/>
+          <w:numId w:val="2"/>
+        </w:numPr>
+        <w:spacing w:after="100" w:line="280"/>
+      </w:pPr>
+      <w:r>
+        <w:rPr>
+          <w:b/>
+          <w:bCs/>
+        </w:rPr>
+        <w:t xml:space="preserve">Clone the repository</w:t>
+      </w:r>
+      <w:r>
+        <w:t xml:space="preserve"> and run </w:t>
+      </w:r>
+      <w:r>
+        <w:rPr>
+          <w:rFonts w:ascii="Consolas" w:cs="Consolas" w:eastAsia="Consolas" w:hAnsi="Consolas"/>
+          <w:sz w:val="20"/>
+          <w:szCs w:val="20"/>
+        </w:rPr>
+        <w:t xml:space="preserve">sudo bash install.sh</w:t>
+      </w:r>
+      <w:r>
+        <w:t xml:space="preserve"> (Steps 2–5). The service file stays in the top folder of the repository.</w:t>
+      </w:r>
+    </w:p>
+    <w:p>
+      <w:pPr>
+        <w:pStyle w:val="ListParagraph"/>
+        <w:numPr>
+          <w:ilvl w:val="0"/>
+          <w:numId w:val="2"/>
+        </w:numPr>
+        <w:spacing w:after="100" w:line="280"/>
+      </w:pPr>
+      <w:r>
+        <w:rPr>
+          <w:b/>
+          <w:bCs/>
+        </w:rPr>
+        <w:t xml:space="preserve">Restore your settings and data</w:t>
+      </w:r>
+      <w:r>
+        <w:t xml:space="preserve"> if you have them: copy </w:t>
+      </w:r>
+      <w:r>
+        <w:rPr>
+          <w:rFonts w:ascii="Consolas" w:cs="Consolas" w:eastAsia="Consolas" w:hAnsi="Consolas"/>
+          <w:sz w:val="20"/>
+          <w:szCs w:val="20"/>
+        </w:rPr>
+        <w:t xml:space="preserve">dome_config.json</w:t>
+      </w:r>
+      <w:r>
+        <w:t xml:space="preserve"> and the </w:t>
+      </w:r>
+      <w:r>
+        <w:rPr>
+          <w:rFonts w:ascii="Consolas" w:cs="Consolas" w:eastAsia="Consolas" w:hAnsi="Consolas"/>
+          <w:sz w:val="20"/>
+          <w:szCs w:val="20"/>
+        </w:rPr>
+        <w:t xml:space="preserve">ai_training/</w:t>
+      </w:r>
+      <w:r>
+        <w:t xml:space="preserve"> folder (images, </w:t>
+      </w:r>
+      <w:r>
+        <w:rPr>
+          <w:rFonts w:ascii="Consolas" w:cs="Consolas" w:eastAsia="Consolas" w:hAnsi="Consolas"/>
+          <w:sz w:val="20"/>
+          <w:szCs w:val="20"/>
+        </w:rPr>
+        <w:t xml:space="preserve">index.json</w:t>
+      </w:r>
+      <w:r>
+        <w:t xml:space="preserve">, </w:t>
+      </w:r>
+      <w:r>
+        <w:rPr>
+          <w:rFonts w:ascii="Consolas" w:cs="Consolas" w:eastAsia="Consolas" w:hAnsi="Consolas"/>
+          <w:sz w:val="20"/>
+          <w:szCs w:val="20"/>
+        </w:rPr>
+        <w:t xml:space="preserve">sensor_log.jsonl</w:t>
+      </w:r>
+      <w:r>
+        <w:t xml:space="preserve">, </w:t>
+      </w:r>
+      <w:r>
+        <w:rPr>
+          <w:rFonts w:ascii="Consolas" w:cs="Consolas" w:eastAsia="Consolas" w:hAnsi="Consolas"/>
+          <w:sz w:val="20"/>
+          <w:szCs w:val="20"/>
+        </w:rPr>
+        <w:t xml:space="preserve">index_copies/</w:t>
+      </w:r>
+      <w:r>
+        <w:t xml:space="preserve">) next to the service file, then restart the service. With only a “Download sensor records” zip, use Classify → Upload sensor records (Section 13).</w:t>
+      </w:r>
+    </w:p>
+    <w:p>
+      <w:pPr>
+        <w:pStyle w:val="ListParagraph"/>
+        <w:numPr>
+          <w:ilvl w:val="0"/>
+          <w:numId w:val="2"/>
+        </w:numPr>
+        <w:spacing w:after="100" w:line="280"/>
+      </w:pPr>
+      <w:r>
+        <w:rPr>
+          <w:b/>
+          <w:bCs/>
+        </w:rPr>
+        <w:t xml:space="preserve">Configure Settings</w:t>
+      </w:r>
+      <w:r>
+        <w:t xml:space="preserve"> (Section 5), including Safety Checks → Steadier AI Sky Prediction and Remote Access (5.10).</w:t>
+      </w:r>
+    </w:p>
+    <w:p>
+      <w:pPr>
+        <w:pStyle w:val="ListParagraph"/>
+        <w:numPr>
+          <w:ilvl w:val="0"/>
+          <w:numId w:val="2"/>
+        </w:numPr>
+        <w:spacing w:after="100" w:line="280"/>
+      </w:pPr>
+      <w:r>
+        <w:rPr>
+          <w:b/>
+          <w:bCs/>
+        </w:rPr>
+        <w:t xml:space="preserve">Optional: simpleCloudDetect</w:t>
+      </w:r>
+      <w:r>
+        <w:t xml:space="preserve"> in Docker (Step 3 note) and the cloud training server on Windows (Section 10, Step 5).</w:t>
+      </w:r>
+    </w:p>
+    <w:p>
+      <w:pPr>
+        <w:pStyle w:val="ListParagraph"/>
+        <w:numPr>
+          <w:ilvl w:val="0"/>
+          <w:numId w:val="2"/>
+        </w:numPr>
+        <w:spacing w:after="100" w:line="280"/>
+      </w:pPr>
+      <w:r>
+        <w:rPr>
+          <w:b/>
+          <w:bCs/>
+        </w:rPr>
+        <w:t xml:space="preserve">Optional: remote access</w:t>
+      </w:r>
+      <w:r>
+        <w:t xml:space="preserve"> with Tailscale and the emailed sign-in code (Section 12).</w:t>
+      </w:r>
+    </w:p>
+    <w:p>
+      <w:pPr>
+        <w:pStyle w:val="ListParagraph"/>
+        <w:numPr>
+          <w:ilvl w:val="0"/>
+          <w:numId w:val="2"/>
+        </w:numPr>
+        <w:spacing w:after="100" w:line="280"/>
+      </w:pPr>
+      <w:r>
+        <w:rPr>
+          <w:b/>
+          <w:bCs/>
+        </w:rPr>
+        <w:t xml:space="preserve">Check it</w:t>
+      </w:r>
+      <w:r>
+        <w:t xml:space="preserve">: open the dashboard, watch the Safety Monitor update by itself, and run the automated tests (Section 8) if you changed any code.</w:t>
       </w:r>
     </w:p>
     <w:p>
@@ -1418,7 +1669,25 @@
         <w:spacing w:after="100" w:line="280"/>
       </w:pPr>
       <w:r>
-        <w:t xml:space="preserve">An ASCOM/Alpaca-aware client on whatever computer runs your imaging session (N.I.N.A., SGPro, or similar), if you intend to connect to this service remotely.</w:t>
+        <w:rPr>
+          <w:b/>
+          <w:bCs/>
+        </w:rPr>
+        <w:t xml:space="preserve">Python 3.12 or newer.</w:t>
+      </w:r>
+      <w:r>
+        <w:t xml:space="preserve"> The service uses Python 3.12 language features and will not start on 3.11. Raspberry Pi OS based on Debian 12 “Bookworm” ships 3.11 — use the newer Trixie-based Raspberry Pi OS (Python 3.13). Check with </w:t>
+      </w:r>
+      <w:r>
+        <w:rPr>
+          <w:rFonts w:ascii="Consolas" w:cs="Consolas" w:eastAsia="Consolas" w:hAnsi="Consolas"/>
+          <w:sz w:val="20"/>
+          <w:szCs w:val="20"/>
+        </w:rPr>
+        <w:t xml:space="preserve">python3 --version</w:t>
+      </w:r>
+      <w:r>
+        <w:t xml:space="preserve">.</w:t>
       </w:r>
     </w:p>
     <w:p>
@@ -1431,21 +1700,7 @@
         <w:spacing w:after="100" w:line="280"/>
       </w:pPr>
       <w:r>
-        <w:t xml:space="preserve">Docker, only if you're running Simple Cloud Detect's container from docker-compose.clouddetect.yml.</w:t>
-      </w:r>
-    </w:p>
-    <w:p>
-      <w:pPr>
-        <w:pStyle w:val="Heading2"/>
-        <w:spacing w:after="140" w:before="340"/>
-      </w:pPr>
-      <w:r>
-        <w:rPr>
-          <w:b/>
-          <w:bCs/>
-          <w:color w:val="1F3A5F"/>
-        </w:rPr>
-        <w:t xml:space="preserve">2.3 Network</w:t>
+        <w:t xml:space="preserve">An ASCOM/Alpaca-aware client on whatever computer runs your imaging session (N.I.N.A., SGPro, or similar), if you intend to connect to this service remotely.</w:t>
       </w:r>
     </w:p>
     <w:p>
@@ -1458,7 +1713,21 @@
         <w:spacing w:after="100" w:line="280"/>
       </w:pPr>
       <w:r>
-        <w:t xml:space="preserve">The Pi and your imaging PC should be on the same network (or otherwise able to reach each other).</w:t>
+        <w:t xml:space="preserve">Docker, only if you're running Simple Cloud Detect's container from docker-compose.clouddetect.yml.</w:t>
+      </w:r>
+    </w:p>
+    <w:p>
+      <w:pPr>
+        <w:pStyle w:val="Heading2"/>
+        <w:spacing w:after="140" w:before="340"/>
+      </w:pPr>
+      <w:r>
+        <w:rPr>
+          <w:b/>
+          <w:bCs/>
+          <w:color w:val="1F3A5F"/>
+        </w:rPr>
+        <w:t xml:space="preserve">2.3 Network</w:t>
       </w:r>
     </w:p>
     <w:p>
@@ -1471,6 +1740,19 @@
         <w:spacing w:after="100" w:line="280"/>
       </w:pPr>
       <w:r>
+        <w:t xml:space="preserve">The Pi and your imaging PC should be on the same network (or otherwise able to reach each other).</w:t>
+      </w:r>
+    </w:p>
+    <w:p>
+      <w:pPr>
+        <w:pStyle w:val="ListParagraph"/>
+        <w:numPr>
+          <w:ilvl w:val="0"/>
+          <w:numId w:val="2"/>
+        </w:numPr>
+        <w:spacing w:after="100" w:line="280"/>
+      </w:pPr>
+      <w:r>
         <w:t xml:space="preserve">Know the Pi's IP address or hostname ahead of time — you'll use it for the web dashboard and for ASCOM discovery.</w:t>
       </w:r>
     </w:p>
@@ -1668,6 +1950,131 @@
     </w:p>
     <w:p>
       <w:pPr>
+        <w:spacing w:after="160" w:line="300"/>
+      </w:pPr>
+      <w:r>
+        <w:rPr>
+          <w:b/>
+          <w:bCs/>
+        </w:rPr>
+        <w:t xml:space="preserve">Folder layout: </w:t>
+      </w:r>
+      <w:r>
+        <w:t xml:space="preserve">the repository keeps </w:t>
+      </w:r>
+      <w:r>
+        <w:rPr>
+          <w:rFonts w:ascii="Consolas" w:cs="Consolas" w:eastAsia="Consolas" w:hAnsi="Consolas"/>
+          <w:sz w:val="20"/>
+          <w:szCs w:val="20"/>
+        </w:rPr>
+        <w:t xml:space="preserve">dome_safety_service.py</w:t>
+      </w:r>
+      <w:r>
+        <w:t xml:space="preserve">, </w:t>
+      </w:r>
+      <w:r>
+        <w:rPr>
+          <w:rFonts w:ascii="Consolas" w:cs="Consolas" w:eastAsia="Consolas" w:hAnsi="Consolas"/>
+          <w:sz w:val="20"/>
+          <w:szCs w:val="20"/>
+        </w:rPr>
+        <w:t xml:space="preserve">install.sh</w:t>
+      </w:r>
+      <w:r>
+        <w:t xml:space="preserve">, </w:t>
+      </w:r>
+      <w:r>
+        <w:rPr>
+          <w:rFonts w:ascii="Consolas" w:cs="Consolas" w:eastAsia="Consolas" w:hAnsi="Consolas"/>
+          <w:sz w:val="20"/>
+          <w:szCs w:val="20"/>
+        </w:rPr>
+        <w:t xml:space="preserve">dome-safety.service</w:t>
+      </w:r>
+      <w:r>
+        <w:t xml:space="preserve"> and </w:t>
+      </w:r>
+      <w:r>
+        <w:rPr>
+          <w:rFonts w:ascii="Consolas" w:cs="Consolas" w:eastAsia="Consolas" w:hAnsi="Consolas"/>
+          <w:sz w:val="20"/>
+          <w:szCs w:val="20"/>
+        </w:rPr>
+        <w:t xml:space="preserve">requirements.txt</w:t>
+      </w:r>
+      <w:r>
+        <w:t xml:space="preserve"> in its top folder (the service's data folders are created next to the service file). Everything else is in sub-folders: </w:t>
+      </w:r>
+      <w:r>
+        <w:rPr>
+          <w:rFonts w:ascii="Consolas" w:cs="Consolas" w:eastAsia="Consolas" w:hAnsi="Consolas"/>
+          <w:sz w:val="20"/>
+          <w:szCs w:val="20"/>
+        </w:rPr>
+        <w:t xml:space="preserve">cloud-training-server/</w:t>
+      </w:r>
+      <w:r>
+        <w:t xml:space="preserve">, </w:t>
+      </w:r>
+      <w:r>
+        <w:rPr>
+          <w:rFonts w:ascii="Consolas" w:cs="Consolas" w:eastAsia="Consolas" w:hAnsi="Consolas"/>
+          <w:sz w:val="20"/>
+          <w:szCs w:val="20"/>
+        </w:rPr>
+        <w:t xml:space="preserve">docker/</w:t>
+      </w:r>
+      <w:r>
+        <w:t xml:space="preserve">, </w:t>
+      </w:r>
+      <w:r>
+        <w:rPr>
+          <w:rFonts w:ascii="Consolas" w:cs="Consolas" w:eastAsia="Consolas" w:hAnsi="Consolas"/>
+          <w:sz w:val="20"/>
+          <w:szCs w:val="20"/>
+        </w:rPr>
+        <w:t xml:space="preserve">docs/</w:t>
+      </w:r>
+      <w:r>
+        <w:t xml:space="preserve"> (this guide, previews, feature mockups), </w:t>
+      </w:r>
+      <w:r>
+        <w:rPr>
+          <w:rFonts w:ascii="Consolas" w:cs="Consolas" w:eastAsia="Consolas" w:hAnsi="Consolas"/>
+          <w:sz w:val="20"/>
+          <w:szCs w:val="20"/>
+        </w:rPr>
+        <w:t xml:space="preserve">tests/</w:t>
+      </w:r>
+      <w:r>
+        <w:t xml:space="preserve"> (automated tests), </w:t>
+      </w:r>
+      <w:r>
+        <w:rPr>
+          <w:rFonts w:ascii="Consolas" w:cs="Consolas" w:eastAsia="Consolas" w:hAnsi="Consolas"/>
+          <w:sz w:val="20"/>
+          <w:szCs w:val="20"/>
+        </w:rPr>
+        <w:t xml:space="preserve">hardware-tests/</w:t>
+      </w:r>
+      <w:r>
+        <w:t xml:space="preserve"> (wiring bring-up scripts) and </w:t>
+      </w:r>
+      <w:r>
+        <w:rPr>
+          <w:rFonts w:ascii="Consolas" w:cs="Consolas" w:eastAsia="Consolas" w:hAnsi="Consolas"/>
+          <w:sz w:val="20"/>
+          <w:szCs w:val="20"/>
+        </w:rPr>
+        <w:t xml:space="preserve">legacy/</w:t>
+      </w:r>
+      <w:r>
+        <w:t xml:space="preserve">.</w:t>
+      </w:r>
+    </w:p>
+    <w:p>
+      <w:pPr>
         <w:pStyle w:val="Heading2"/>
         <w:spacing w:after="140" w:before="340"/>
       </w:pPr>
@@ -1717,6 +2124,55 @@
           <w:szCs w:val="20"/>
         </w:rPr>
         <w:t xml:space="preserve">            adafruit-extended-bus rpi-lgpio</w:t>
+      </w:r>
+    </w:p>
+    <w:p>
+      <w:pPr>
+        <w:spacing w:after="160" w:line="300"/>
+      </w:pPr>
+      <w:r>
+        <w:rPr>
+          <w:b/>
+          <w:bCs/>
+        </w:rPr>
+        <w:t xml:space="preserve">Optional — simpleCloudDetect: </w:t>
+      </w:r>
+      <w:r>
+        <w:t xml:space="preserve">the Simple Cloud Detect ML check needs simpleCloudDetect running (it reads Allsky's latest image). With Docker installed, from the repository folder:</w:t>
+      </w:r>
+    </w:p>
+    <w:p>
+      <w:pPr>
+        <w:shd w:fill="F2F3F5" w:val="clear"/>
+        <w:spacing w:after="220" w:before="120" w:line="264"/>
+        <w:ind w:left="260" w:right="260"/>
+      </w:pPr>
+      <w:r>
+        <w:rPr>
+          <w:rFonts w:ascii="Consolas" w:cs="Consolas" w:eastAsia="Consolas" w:hAnsi="Consolas"/>
+          <w:sz w:val="20"/>
+          <w:szCs w:val="20"/>
+        </w:rPr>
+        <w:t xml:space="preserve">docker compose -f docker/docker-compose.clouddetect.yml up -d</w:t>
+      </w:r>
+    </w:p>
+    <w:p>
+      <w:pPr>
+        <w:spacing w:after="160" w:line="300"/>
+      </w:pPr>
+      <w:r>
+        <w:t xml:space="preserve">Its settings are kept in </w:t>
+      </w:r>
+      <w:r>
+        <w:rPr>
+          <w:rFonts w:ascii="Consolas" w:cs="Consolas" w:eastAsia="Consolas" w:hAnsi="Consolas"/>
+          <w:sz w:val="20"/>
+          <w:szCs w:val="20"/>
+        </w:rPr>
+        <w:t xml:space="preserve">clouddetect-config/</w:t>
+      </w:r>
+      <w:r>
+        <w:t xml:space="preserve"> in the repository's top folder.</w:t>
       </w:r>
     </w:p>
     <w:p>
@@ -2875,6 +3331,128 @@
     </w:p>
     <w:p>
       <w:pPr>
+        <w:pStyle w:val="Heading3"/>
+        <w:spacing w:after="100" w:before="220"/>
+      </w:pPr>
+      <w:r>
+        <w:rPr>
+          <w:b/>
+          <w:bCs/>
+          <w:color w:val="2F6F4E"/>
+        </w:rPr>
+        <w:t xml:space="preserve">Dew risk check</w:t>
+      </w:r>
+    </w:p>
+    <w:p>
+      <w:pPr>
+        <w:spacing w:after="160" w:line="300"/>
+      </w:pPr>
+      <w:r>
+        <w:t xml:space="preserve">Evaluates the risk of dew forming from the outside temperature and humidity, with different rules per season, and shows it on the dashboard. It is </w:t>
+      </w:r>
+      <w:r>
+        <w:rPr>
+          <w:b/>
+          <w:bCs/>
+        </w:rPr>
+        <w:t xml:space="preserve">excluded from SAFE/UNSAFE by default</w:t>
+      </w:r>
+      <w:r>
+        <w:t xml:space="preserve">; tick “Dew risk check counts toward SAFE/UNSAFE” to include it, which also adds a Dew Risk lane to the Safety Checks History graph. If either reading is missing while it's included, it counts as UNSAFE.</w:t>
+      </w:r>
+    </w:p>
+    <w:p>
+      <w:pPr>
+        <w:pStyle w:val="Heading3"/>
+        <w:spacing w:after="100" w:before="220"/>
+      </w:pPr>
+      <w:r>
+        <w:rPr>
+          <w:b/>
+          <w:bCs/>
+          <w:color w:val="2F6F4E"/>
+        </w:rPr>
+        <w:t xml:space="preserve">Steadier AI Sky Prediction</w:t>
+      </w:r>
+    </w:p>
+    <w:p>
+      <w:pPr>
+        <w:spacing w:after="160" w:line="300"/>
+      </w:pPr>
+      <w:r>
+        <w:t xml:space="preserve">Stops the AI Sky Prediction (and SAFE/UNSAFE) flipping between Clear and Cloudy when the sky sits close to a cutoff. Shown under the AI Model check:</w:t>
+      </w:r>
+    </w:p>
+    <w:p>
+      <w:pPr>
+        <w:pStyle w:val="ListParagraph"/>
+        <w:numPr>
+          <w:ilvl w:val="0"/>
+          <w:numId w:val="2"/>
+        </w:numPr>
+        <w:spacing w:after="100" w:line="280"/>
+      </w:pPr>
+      <w:r>
+        <w:rPr>
+          <w:b/>
+          <w:bCs/>
+        </w:rPr>
+        <w:t xml:space="preserve">Readings to combine</w:t>
+      </w:r>
+      <w:r>
+        <w:t xml:space="preserve"> (default 10): the MLX is read every 2 s, so 10 readings ≈ 20 s, about 10 s of delay when real clouds arrive. 1 = off.</w:t>
+      </w:r>
+    </w:p>
+    <w:p>
+      <w:pPr>
+        <w:pStyle w:val="ListParagraph"/>
+        <w:numPr>
+          <w:ilvl w:val="0"/>
+          <w:numId w:val="2"/>
+        </w:numPr>
+        <w:spacing w:after="100" w:line="280"/>
+      </w:pPr>
+      <w:r>
+        <w:rPr>
+          <w:b/>
+          <w:bCs/>
+        </w:rPr>
+        <w:t xml:space="preserve">Combine using</w:t>
+      </w:r>
+      <w:r>
+        <w:t xml:space="preserve">: Median (default — a single bad reading is ignored) or Average.</w:t>
+      </w:r>
+    </w:p>
+    <w:p>
+      <w:pPr>
+        <w:pStyle w:val="ListParagraph"/>
+        <w:numPr>
+          <w:ilvl w:val="0"/>
+          <w:numId w:val="2"/>
+        </w:numPr>
+        <w:spacing w:after="100" w:line="280"/>
+      </w:pPr>
+      <w:r>
+        <w:rPr>
+          <w:b/>
+          <w:bCs/>
+        </w:rPr>
+        <w:t xml:space="preserve">Dead band</w:t>
+      </w:r>
+      <w:r>
+        <w:t xml:space="preserve"> (default 0.5 °C): the prediction only changes once the value is past a cutoff by more than this, in both directions. 0 = off.</w:t>
+      </w:r>
+    </w:p>
+    <w:p>
+      <w:pPr>
+        <w:spacing w:after="160" w:line="300"/>
+      </w:pPr>
+      <w:r>
+        <w:t xml:space="preserve">The dashboard row shows how far the reading is from the next class (e.g. “1.0 °C from Cloudy”) and “median of 10”. Training always uses the stored readings, so these settings never change what the model learns.</w:t>
+      </w:r>
+    </w:p>
+    <w:p>
+      <w:pPr>
         <w:pStyle w:val="Heading2"/>
         <w:spacing w:after="140" w:before="340"/>
       </w:pPr>
@@ -3502,6 +4080,210 @@
     <w:p>
       <w:r>
         <w:br w:type="page"/>
+      </w:r>
+    </w:p>
+    <w:p>
+      <w:pPr>
+        <w:pStyle w:val="Heading2"/>
+        <w:spacing w:after="140" w:before="340"/>
+      </w:pPr>
+      <w:r>
+        <w:rPr>
+          <w:b/>
+          <w:bCs/>
+          <w:color w:val="1F3A5F"/>
+        </w:rPr>
+        <w:t xml:space="preserve">5.10 Remote Access</w:t>
+      </w:r>
+    </w:p>
+    <w:p>
+      <w:pPr>
+        <w:spacing w:after="160" w:line="300"/>
+      </w:pPr>
+      <w:r>
+        <w:t xml:space="preserve">Controls sign-in for requests from </w:t>
+      </w:r>
+      <w:r>
+        <w:rPr>
+          <w:b/>
+          <w:bCs/>
+        </w:rPr>
+        <w:t xml:space="preserve">outside your home network</w:t>
+      </w:r>
+      <w:r>
+        <w:t xml:space="preserve"> (Tailscale addresses 100.64.x.x–100.127.x.x, or anything public). Requests from the Pi itself or your home network never need to sign in. This section is only shown — and can only be saved — from your home network.</w:t>
+      </w:r>
+    </w:p>
+    <w:p>
+      <w:pPr>
+        <w:pStyle w:val="ListParagraph"/>
+        <w:numPr>
+          <w:ilvl w:val="0"/>
+          <w:numId w:val="2"/>
+        </w:numPr>
+        <w:spacing w:after="100" w:line="280"/>
+      </w:pPr>
+      <w:r>
+        <w:rPr>
+          <w:b/>
+          <w:bCs/>
+        </w:rPr>
+        <w:t xml:space="preserve">Require login + email code for outside access</w:t>
+      </w:r>
+      <w:r>
+        <w:t xml:space="preserve"> — keep this on. Off lets anyone who reaches the Pi from outside control everything.</w:t>
+      </w:r>
+    </w:p>
+    <w:p>
+      <w:pPr>
+        <w:pStyle w:val="ListParagraph"/>
+        <w:numPr>
+          <w:ilvl w:val="0"/>
+          <w:numId w:val="2"/>
+        </w:numPr>
+        <w:spacing w:after="100" w:line="280"/>
+      </w:pPr>
+      <w:r>
+        <w:rPr>
+          <w:b/>
+          <w:bCs/>
+        </w:rPr>
+        <w:t xml:space="preserve">Username / New password</w:t>
+      </w:r>
+      <w:r>
+        <w:t xml:space="preserve"> — default username </w:t>
+      </w:r>
+      <w:r>
+        <w:rPr>
+          <w:rFonts w:ascii="Consolas" w:cs="Consolas" w:eastAsia="Consolas" w:hAnsi="Consolas"/>
+          <w:sz w:val="20"/>
+          <w:szCs w:val="20"/>
+        </w:rPr>
+        <w:t xml:space="preserve">admin</w:t>
+      </w:r>
+      <w:r>
+        <w:t xml:space="preserve">; change the default password here on first setup. No old password is needed (you're at home). Stored only as a scrypt hash in </w:t>
+      </w:r>
+      <w:r>
+        <w:rPr>
+          <w:rFonts w:ascii="Consolas" w:cs="Consolas" w:eastAsia="Consolas" w:hAnsi="Consolas"/>
+          <w:sz w:val="20"/>
+          <w:szCs w:val="20"/>
+        </w:rPr>
+        <w:t xml:space="preserve">dome_config.json</w:t>
+      </w:r>
+      <w:r>
+        <w:t xml:space="preserve">; changing it signs out every outside session.</w:t>
+      </w:r>
+    </w:p>
+    <w:p>
+      <w:pPr>
+        <w:pStyle w:val="ListParagraph"/>
+        <w:numPr>
+          <w:ilvl w:val="0"/>
+          <w:numId w:val="2"/>
+        </w:numPr>
+        <w:spacing w:after="100" w:line="280"/>
+      </w:pPr>
+      <w:r>
+        <w:rPr>
+          <w:b/>
+          <w:bCs/>
+        </w:rPr>
+        <w:t xml:space="preserve">Email for codes</w:t>
+      </w:r>
+      <w:r>
+        <w:t xml:space="preserve"> — the address that receives the 6-digit sign-in code, plus the sending account: for Gmail use server </w:t>
+      </w:r>
+      <w:r>
+        <w:rPr>
+          <w:rFonts w:ascii="Consolas" w:cs="Consolas" w:eastAsia="Consolas" w:hAnsi="Consolas"/>
+          <w:sz w:val="20"/>
+          <w:szCs w:val="20"/>
+        </w:rPr>
+        <w:t xml:space="preserve">smtp.gmail.com</w:t>
+      </w:r>
+      <w:r>
+        <w:t xml:space="preserve">, port </w:t>
+      </w:r>
+      <w:r>
+        <w:rPr>
+          <w:rFonts w:ascii="Consolas" w:cs="Consolas" w:eastAsia="Consolas" w:hAnsi="Consolas"/>
+          <w:sz w:val="20"/>
+          <w:szCs w:val="20"/>
+        </w:rPr>
+        <w:t xml:space="preserve">587</w:t>
+      </w:r>
+      <w:r>
+        <w:t xml:space="preserve">, your Gmail address, and a Google </w:t>
+      </w:r>
+      <w:r>
+        <w:rPr>
+          <w:b/>
+          <w:bCs/>
+        </w:rPr>
+        <w:t xml:space="preserve">App password</w:t>
+      </w:r>
+      <w:r>
+        <w:t xml:space="preserve"> (Google Account → Security → 2-Step Verification on → App passwords) — not your normal password.</w:t>
+      </w:r>
+    </w:p>
+    <w:p>
+      <w:pPr>
+        <w:pStyle w:val="ListParagraph"/>
+        <w:numPr>
+          <w:ilvl w:val="0"/>
+          <w:numId w:val="2"/>
+        </w:numPr>
+        <w:spacing w:after="100" w:line="280"/>
+      </w:pPr>
+      <w:r>
+        <w:rPr>
+          <w:b/>
+          <w:bCs/>
+        </w:rPr>
+        <w:t xml:space="preserve">Trust a browser for (days)</w:t>
+      </w:r>
+      <w:r>
+        <w:t xml:space="preserve"> — default 7. Unticked at sign-in, a session lasts 12 hours. 5 wrong passwords or codes from one address block it for 15 minutes.</w:t>
+      </w:r>
+    </w:p>
+    <w:p>
+      <w:pPr>
+        <w:pStyle w:val="ListParagraph"/>
+        <w:numPr>
+          <w:ilvl w:val="0"/>
+          <w:numId w:val="2"/>
+        </w:numPr>
+        <w:spacing w:after="100" w:line="280"/>
+      </w:pPr>
+      <w:r>
+        <w:rPr>
+          <w:b/>
+          <w:bCs/>
+        </w:rPr>
+        <w:t xml:space="preserve">Send test email / Sign out all remote sessions</w:t>
+      </w:r>
+      <w:r>
+        <w:t xml:space="preserve"> — check the email settings; end every outside session at once.</w:t>
+      </w:r>
+    </w:p>
+    <w:p>
+      <w:pPr>
+        <w:spacing w:after="160" w:line="300"/>
+      </w:pPr>
+      <w:r>
+        <w:t xml:space="preserve">From outside: open the dashboard, enter the username and password, then the code from your email. You then have full access, except this section. ASCOM Alpaca is refused from outside — NINA on the observatory network is not affected. Sign-ins and failures are logged under the </w:t>
+      </w:r>
+      <w:r>
+        <w:rPr>
+          <w:b/>
+          <w:bCs/>
+        </w:rPr>
+        <w:t xml:space="preserve">Security</w:t>
+      </w:r>
+      <w:r>
+        <w:t xml:space="preserve"> category on the Logs page.</w:t>
       </w:r>
     </w:p>
     <w:p>
@@ -3916,6 +4698,156 @@
     </w:p>
     <w:p>
       <w:pPr>
+        <w:spacing w:after="160" w:line="300"/>
+      </w:pPr>
+      <w:r>
+        <w:rPr>
+          <w:b/>
+          <w:bCs/>
+        </w:rPr>
+        <w:t xml:space="preserve">With git (recommended): </w:t>
+      </w:r>
+      <w:r>
+        <w:t xml:space="preserve">on the Pi, in the repository folder:</w:t>
+      </w:r>
+    </w:p>
+    <w:p>
+      <w:pPr>
+        <w:shd w:fill="F2F3F5" w:val="clear"/>
+        <w:spacing w:after="0" w:before="120" w:line="264"/>
+        <w:ind w:left="260" w:right="260"/>
+      </w:pPr>
+      <w:r>
+        <w:rPr>
+          <w:rFonts w:ascii="Consolas" w:cs="Consolas" w:eastAsia="Consolas" w:hAnsi="Consolas"/>
+          <w:sz w:val="20"/>
+          <w:szCs w:val="20"/>
+        </w:rPr>
+        <w:t xml:space="preserve">git pull</w:t>
+      </w:r>
+    </w:p>
+    <w:p>
+      <w:pPr>
+        <w:shd w:fill="F2F3F5" w:val="clear"/>
+        <w:spacing w:after="220" w:before="0" w:line="264"/>
+        <w:ind w:left="260" w:right="260"/>
+      </w:pPr>
+      <w:r>
+        <w:rPr>
+          <w:rFonts w:ascii="Consolas" w:cs="Consolas" w:eastAsia="Consolas" w:hAnsi="Consolas"/>
+          <w:sz w:val="20"/>
+          <w:szCs w:val="20"/>
+        </w:rPr>
+        <w:t xml:space="preserve">sudo systemctl restart dome-safety.service</w:t>
+      </w:r>
+    </w:p>
+    <w:p>
+      <w:pPr>
+        <w:spacing w:after="160" w:line="300"/>
+      </w:pPr>
+      <w:r>
+        <w:rPr>
+          <w:b/>
+          <w:bCs/>
+        </w:rPr>
+        <w:t xml:space="preserve">Automated tests: </w:t>
+      </w:r>
+      <w:r>
+        <w:t xml:space="preserve">after changing the code on a computer, run the test suite (it stubs the Pi hardware and works in a temporary folder, so it never touches your settings or data):</w:t>
+      </w:r>
+    </w:p>
+    <w:p>
+      <w:pPr>
+        <w:shd w:fill="F2F3F5" w:val="clear"/>
+        <w:spacing w:after="0" w:before="120" w:line="264"/>
+        <w:ind w:left="260" w:right="260"/>
+      </w:pPr>
+      <w:r>
+        <w:rPr>
+          <w:rFonts w:ascii="Consolas" w:cs="Consolas" w:eastAsia="Consolas" w:hAnsi="Consolas"/>
+          <w:sz w:val="20"/>
+          <w:szCs w:val="20"/>
+        </w:rPr>
+        <w:t xml:space="preserve">cd tests</w:t>
+      </w:r>
+    </w:p>
+    <w:p>
+      <w:pPr>
+        <w:shd w:fill="F2F3F5" w:val="clear"/>
+        <w:spacing w:after="0" w:before="0" w:line="264"/>
+        <w:ind w:left="260" w:right="260"/>
+      </w:pPr>
+      <w:r>
+        <w:rPr>
+          <w:rFonts w:ascii="Consolas" w:cs="Consolas" w:eastAsia="Consolas" w:hAnsi="Consolas"/>
+          <w:sz w:val="20"/>
+          <w:szCs w:val="20"/>
+        </w:rPr>
+        <w:t xml:space="preserve">python3 test_safety_history.py</w:t>
+      </w:r>
+    </w:p>
+    <w:p>
+      <w:pPr>
+        <w:shd w:fill="F2F3F5" w:val="clear"/>
+        <w:spacing w:after="0" w:before="0" w:line="264"/>
+        <w:ind w:left="260" w:right="260"/>
+      </w:pPr>
+      <w:r>
+        <w:rPr>
+          <w:rFonts w:ascii="Consolas" w:cs="Consolas" w:eastAsia="Consolas" w:hAnsi="Consolas"/>
+          <w:sz w:val="20"/>
+          <w:szCs w:val="20"/>
+        </w:rPr>
+        <w:t xml:space="preserve">python3 test_import_unclassify.py</w:t>
+      </w:r>
+    </w:p>
+    <w:p>
+      <w:pPr>
+        <w:shd w:fill="F2F3F5" w:val="clear"/>
+        <w:spacing w:after="0" w:before="0" w:line="264"/>
+        <w:ind w:left="260" w:right="260"/>
+      </w:pPr>
+      <w:r>
+        <w:rPr>
+          <w:rFonts w:ascii="Consolas" w:cs="Consolas" w:eastAsia="Consolas" w:hAnsi="Consolas"/>
+          <w:sz w:val="20"/>
+          <w:szCs w:val="20"/>
+        </w:rPr>
+        <w:t xml:space="preserve">python3 test_index_safety.py</w:t>
+      </w:r>
+    </w:p>
+    <w:p>
+      <w:pPr>
+        <w:shd w:fill="F2F3F5" w:val="clear"/>
+        <w:spacing w:after="0" w:before="0" w:line="264"/>
+        <w:ind w:left="260" w:right="260"/>
+      </w:pPr>
+      <w:r>
+        <w:rPr>
+          <w:rFonts w:ascii="Consolas" w:cs="Consolas" w:eastAsia="Consolas" w:hAnsi="Consolas"/>
+          <w:sz w:val="20"/>
+          <w:szCs w:val="20"/>
+        </w:rPr>
+        <w:t xml:space="preserve">python3 test_ai_smoothing.py</w:t>
+      </w:r>
+    </w:p>
+    <w:p>
+      <w:pPr>
+        <w:shd w:fill="F2F3F5" w:val="clear"/>
+        <w:spacing w:after="220" w:before="0" w:line="264"/>
+        <w:ind w:left="260" w:right="260"/>
+      </w:pPr>
+      <w:r>
+        <w:rPr>
+          <w:rFonts w:ascii="Consolas" w:cs="Consolas" w:eastAsia="Consolas" w:hAnsi="Consolas"/>
+          <w:sz w:val="20"/>
+          <w:szCs w:val="20"/>
+        </w:rPr>
+        <w:t xml:space="preserve">RA_DEFAULT_PW='&lt;default password&gt;' python3 test_remote_access.py</w:t>
+      </w:r>
+    </w:p>
+    <w:p>
+      <w:pPr>
         <w:pStyle w:val="Heading1"/>
         <w:pBdr>
           <w:bottom w:val="single" w:color="1F3A5F" w:sz="6" w:space="4"/>
@@ -4401,6 +5333,80 @@
     </w:p>
     <w:p>
       <w:pPr>
+        <w:pStyle w:val="Heading3"/>
+        <w:spacing w:after="100" w:before="220"/>
+      </w:pPr>
+      <w:r>
+        <w:rPr>
+          <w:b/>
+          <w:bCs/>
+          <w:color w:val="2F6F4E"/>
+        </w:rPr>
+        <w:t xml:space="preserve">Step 6 — Import images (AI Cloud Detect only)</w:t>
+      </w:r>
+    </w:p>
+    <w:p>
+      <w:pPr>
+        <w:spacing w:after="160" w:line="300"/>
+      </w:pPr>
+      <w:r>
+        <w:t xml:space="preserve">Classify page → </w:t>
+      </w:r>
+      <w:r>
+        <w:rPr>
+          <w:b/>
+          <w:bCs/>
+        </w:rPr>
+        <w:t xml:space="preserve">⇧ Import images</w:t>
+      </w:r>
+      <w:r>
+        <w:t xml:space="preserve">: drop JPG/PNG files (up to 10 MB each; duplicates are skipped) and optionally pick a label. Imported images have no sensor readings, so they train </w:t>
+      </w:r>
+      <w:r>
+        <w:rPr>
+          <w:b/>
+          <w:bCs/>
+        </w:rPr>
+        <w:t xml:space="preserve">AI Cloud Detect only</w:t>
+      </w:r>
+      <w:r>
+        <w:t xml:space="preserve"> — never the sensor-based AI Sky Prediction. They show an “Image only · imported” tag; filter them with Show → By source.</w:t>
+      </w:r>
+    </w:p>
+    <w:p>
+      <w:pPr>
+        <w:pStyle w:val="Heading3"/>
+        <w:spacing w:after="100" w:before="220"/>
+      </w:pPr>
+      <w:r>
+        <w:rPr>
+          <w:b/>
+          <w:bCs/>
+          <w:color w:val="2F6F4E"/>
+        </w:rPr>
+        <w:t xml:space="preserve">Step 7 — Unclassify</w:t>
+      </w:r>
+    </w:p>
+    <w:p>
+      <w:pPr>
+        <w:spacing w:after="160" w:line="300"/>
+      </w:pPr>
+      <w:r>
+        <w:t xml:space="preserve">Select labelled images and click </w:t>
+      </w:r>
+      <w:r>
+        <w:rPr>
+          <w:b/>
+          <w:bCs/>
+        </w:rPr>
+        <w:t xml:space="preserve">↩ Unclassify selected</w:t>
+      </w:r>
+      <w:r>
+        <w:t xml:space="preserve"> (or ↩ Unclassify in the one-by-one view) to send them back to Unclassified. Sensor readings and the image are kept. Images already deleted after training are skipped, since they couldn't be labelled again — delete those instead if the label is wrong.</w:t>
+      </w:r>
+    </w:p>
+    <w:p>
+      <w:pPr>
         <w:pStyle w:val="Heading1"/>
         <w:pBdr>
           <w:bottom w:val="single" w:color="1F3A5F" w:sz="6" w:space="4"/>
@@ -4661,6 +5667,747 @@
     <w:p>
       <w:r>
         <w:br w:type="page"/>
+      </w:r>
+    </w:p>
+    <w:p>
+      <w:pPr>
+        <w:pStyle w:val="Heading3"/>
+        <w:spacing w:after="100" w:before="220"/>
+      </w:pPr>
+      <w:r>
+        <w:rPr>
+          <w:b/>
+          <w:bCs/>
+          <w:color w:val="2F6F4E"/>
+        </w:rPr>
+        <w:t xml:space="preserve">AI Sky Prediction flips between Clear and Cloudy</w:t>
+      </w:r>
+    </w:p>
+    <w:p>
+      <w:pPr>
+        <w:spacing w:after="160" w:line="300"/>
+      </w:pPr>
+      <w:r>
+        <w:t xml:space="preserve">The reading is close to the Clear/Cloudy cutoff and normal sensor noise crosses it. Check Settings → Safety Checks → Steadier AI Sky Prediction (Median of 10, dead band 0.5 °C). The dashboard's “°C from …” tag shows how close it is. On warm nights, labelling a few more clear nights and retraining moves the cutoff.</w:t>
+      </w:r>
+    </w:p>
+    <w:p>
+      <w:pPr>
+        <w:pStyle w:val="Heading3"/>
+        <w:spacing w:after="100" w:before="220"/>
+      </w:pPr>
+      <w:r>
+        <w:rPr>
+          <w:b/>
+          <w:bCs/>
+          <w:color w:val="2F6F4E"/>
+        </w:rPr>
+        <w:t xml:space="preserve">The Classify list is empty but the images folder has files</w:t>
+      </w:r>
+    </w:p>
+    <w:p>
+      <w:pPr>
+        <w:spacing w:after="160" w:line="300"/>
+      </w:pPr>
+      <w:r>
+        <w:t xml:space="preserve">The sample list was damaged. Open the Classify page: the </w:t>
+      </w:r>
+      <w:r>
+        <w:rPr>
+          <w:b/>
+          <w:bCs/>
+        </w:rPr>
+        <w:t xml:space="preserve">Recovery</w:t>
+      </w:r>
+      <w:r>
+        <w:t xml:space="preserve"> card offers to restore the list from a training copy or the sensor log, and to put the images back in the list. See Section 13.</w:t>
+      </w:r>
+    </w:p>
+    <w:p>
+      <w:pPr>
+        <w:pStyle w:val="Heading3"/>
+        <w:spacing w:after="100" w:before="220"/>
+      </w:pPr>
+      <w:r>
+        <w:rPr>
+          <w:b/>
+          <w:bCs/>
+          <w:color w:val="2F6F4E"/>
+        </w:rPr>
+        <w:t xml:space="preserve">The sign-in code email doesn't arrive</w:t>
+      </w:r>
+    </w:p>
+    <w:p>
+      <w:pPr>
+        <w:spacing w:after="160" w:line="300"/>
+      </w:pPr>
+      <w:r>
+        <w:t xml:space="preserve">From home, Settings → Remote Access → Send test email. Check the Gmail App password (not your normal password), server smtp.gmail.com and port 587, and your spam folder. Until it works, use the dashboard from your home network.</w:t>
+      </w:r>
+    </w:p>
+    <w:p>
+      <w:pPr>
+        <w:pStyle w:val="Heading3"/>
+        <w:spacing w:after="100" w:before="220"/>
+      </w:pPr>
+      <w:r>
+        <w:rPr>
+          <w:b/>
+          <w:bCs/>
+          <w:color w:val="2F6F4E"/>
+        </w:rPr>
+        <w:t xml:space="preserve">“Image not on disk” on a Classify card</w:t>
+      </w:r>
+    </w:p>
+    <w:p>
+      <w:pPr>
+        <w:spacing w:after="160" w:line="300"/>
+      </w:pPr>
+      <w:r>
+        <w:t xml:space="preserve">The sample's labels and sensor readings are kept but its picture file is gone. If AllSky still has the frame, the Recovery card's “Recover images from AllSky archive” copies it back (it looks in </w:t>
+      </w:r>
+      <w:r>
+        <w:rPr>
+          <w:rFonts w:ascii="Consolas" w:cs="Consolas" w:eastAsia="Consolas" w:hAnsi="Consolas"/>
+          <w:sz w:val="20"/>
+          <w:szCs w:val="20"/>
+        </w:rPr>
+        <w:t xml:space="preserve">~/allsky/images</w:t>
+      </w:r>
+      <w:r>
+        <w:t xml:space="preserve"> for a frame taken within 90 s).</w:t>
+      </w:r>
+    </w:p>
+    <w:p>
+      <w:pPr>
+        <w:pStyle w:val="Heading1"/>
+        <w:pBdr>
+          <w:bottom w:val="single" w:color="1F3A5F" w:sz="6" w:space="4"/>
+        </w:pBdr>
+        <w:spacing w:after="200" w:before="480"/>
+      </w:pPr>
+      <w:r>
+        <w:rPr>
+          <w:b/>
+          <w:bCs/>
+          <w:color w:val="1F3A5F"/>
+        </w:rPr>
+        <w:t xml:space="preserve">12. Remote Access from Anywhere (Tailscale)</w:t>
+      </w:r>
+    </w:p>
+    <w:p>
+      <w:pPr>
+        <w:spacing w:after="160" w:line="300"/>
+      </w:pPr>
+      <w:r>
+        <w:t xml:space="preserve">Use Tailscale to reach the Pi and the NINA PC from anywhere without opening any ports on your router. Do </w:t>
+      </w:r>
+      <w:r>
+        <w:rPr>
+          <w:b/>
+          <w:bCs/>
+        </w:rPr>
+        <w:t xml:space="preserve">not</w:t>
+      </w:r>
+      <w:r>
+        <w:t xml:space="preserve"> port-forward 11112 — the dashboard controls the roof.</w:t>
+      </w:r>
+    </w:p>
+    <w:p>
+      <w:pPr>
+        <w:pStyle w:val="Heading3"/>
+        <w:spacing w:after="100" w:before="220"/>
+      </w:pPr>
+      <w:r>
+        <w:rPr>
+          <w:b/>
+          <w:bCs/>
+          <w:color w:val="2F6F4E"/>
+        </w:rPr>
+        <w:t xml:space="preserve">On the Pi</w:t>
+      </w:r>
+    </w:p>
+    <w:p>
+      <w:pPr>
+        <w:shd w:fill="F2F3F5" w:val="clear"/>
+        <w:spacing w:after="0" w:before="120" w:line="264"/>
+        <w:ind w:left="260" w:right="260"/>
+      </w:pPr>
+      <w:r>
+        <w:rPr>
+          <w:rFonts w:ascii="Consolas" w:cs="Consolas" w:eastAsia="Consolas" w:hAnsi="Consolas"/>
+          <w:sz w:val="20"/>
+          <w:szCs w:val="20"/>
+        </w:rPr>
+        <w:t xml:space="preserve">curl -fsSL https://tailscale.com/install.sh | sh</w:t>
+      </w:r>
+    </w:p>
+    <w:p>
+      <w:pPr>
+        <w:shd w:fill="F2F3F5" w:val="clear"/>
+        <w:spacing w:after="0" w:before="0" w:line="264"/>
+        <w:ind w:left="260" w:right="260"/>
+      </w:pPr>
+      <w:r>
+        <w:rPr>
+          <w:rFonts w:ascii="Consolas" w:cs="Consolas" w:eastAsia="Consolas" w:hAnsi="Consolas"/>
+          <w:sz w:val="20"/>
+          <w:szCs w:val="20"/>
+        </w:rPr>
+        <w:t xml:space="preserve">sudo tailscale up</w:t>
+      </w:r>
+    </w:p>
+    <w:p>
+      <w:pPr>
+        <w:shd w:fill="F2F3F5" w:val="clear"/>
+        <w:spacing w:after="220" w:before="0" w:line="264"/>
+        <w:ind w:left="260" w:right="260"/>
+      </w:pPr>
+      <w:r>
+        <w:rPr>
+          <w:rFonts w:ascii="Consolas" w:cs="Consolas" w:eastAsia="Consolas" w:hAnsi="Consolas"/>
+          <w:sz w:val="20"/>
+          <w:szCs w:val="20"/>
+        </w:rPr>
+        <w:t xml:space="preserve">tailscale ip -4</w:t>
+      </w:r>
+    </w:p>
+    <w:p>
+      <w:pPr>
+        <w:spacing w:after="160" w:line="300"/>
+      </w:pPr>
+      <w:r>
+        <w:t xml:space="preserve">Open the link printed by </w:t>
+      </w:r>
+      <w:r>
+        <w:rPr>
+          <w:rFonts w:ascii="Consolas" w:cs="Consolas" w:eastAsia="Consolas" w:hAnsi="Consolas"/>
+          <w:sz w:val="20"/>
+          <w:szCs w:val="20"/>
+        </w:rPr>
+        <w:t xml:space="preserve">tailscale up</w:t>
+      </w:r>
+      <w:r>
+        <w:t xml:space="preserve"> and sign in. Then in the Tailscale admin page (Machines), choose the Pi → </w:t>
+      </w:r>
+      <w:r>
+        <w:rPr>
+          <w:b/>
+          <w:bCs/>
+        </w:rPr>
+        <w:t xml:space="preserve">Disable key expiry</w:t>
+      </w:r>
+      <w:r>
+        <w:t xml:space="preserve">.</w:t>
+      </w:r>
+    </w:p>
+    <w:p>
+      <w:pPr>
+        <w:pStyle w:val="Heading3"/>
+        <w:spacing w:after="100" w:before="220"/>
+      </w:pPr>
+      <w:r>
+        <w:rPr>
+          <w:b/>
+          <w:bCs/>
+          <w:color w:val="2F6F4E"/>
+        </w:rPr>
+        <w:t xml:space="preserve">On your phone / laptop</w:t>
+      </w:r>
+    </w:p>
+    <w:p>
+      <w:pPr>
+        <w:spacing w:after="160" w:line="300"/>
+      </w:pPr>
+      <w:r>
+        <w:t xml:space="preserve">Install the Tailscale app, sign in with the same account, and open </w:t>
+      </w:r>
+      <w:r>
+        <w:rPr>
+          <w:rFonts w:ascii="Consolas" w:cs="Consolas" w:eastAsia="Consolas" w:hAnsi="Consolas"/>
+          <w:sz w:val="20"/>
+          <w:szCs w:val="20"/>
+        </w:rPr>
+        <w:t xml:space="preserve">http://&lt;pi-tailscale-name&gt;:11112</w:t>
+      </w:r>
+      <w:r>
+        <w:t xml:space="preserve">. You'll be asked for the username, password and emailed code (5.10).</w:t>
+      </w:r>
+    </w:p>
+    <w:p>
+      <w:pPr>
+        <w:pStyle w:val="Heading3"/>
+        <w:spacing w:after="100" w:before="220"/>
+      </w:pPr>
+      <w:r>
+        <w:rPr>
+          <w:b/>
+          <w:bCs/>
+          <w:color w:val="2F6F4E"/>
+        </w:rPr>
+        <w:t xml:space="preserve">NINA PC (Remote Desktop)</w:t>
+      </w:r>
+    </w:p>
+    <w:p>
+      <w:pPr>
+        <w:pStyle w:val="ListParagraph"/>
+        <w:numPr>
+          <w:ilvl w:val="0"/>
+          <w:numId w:val="2"/>
+        </w:numPr>
+        <w:spacing w:after="100" w:line="280"/>
+      </w:pPr>
+      <w:r>
+        <w:t xml:space="preserve">Install Tailscale (same account); tray icon → Preferences → </w:t>
+      </w:r>
+      <w:r>
+        <w:rPr>
+          <w:b/>
+          <w:bCs/>
+        </w:rPr>
+        <w:t xml:space="preserve">Run unattended</w:t>
+      </w:r>
+      <w:r>
+        <w:t xml:space="preserve">; disable key expiry for it.</w:t>
+      </w:r>
+    </w:p>
+    <w:p>
+      <w:pPr>
+        <w:pStyle w:val="ListParagraph"/>
+        <w:numPr>
+          <w:ilvl w:val="0"/>
+          <w:numId w:val="2"/>
+        </w:numPr>
+        <w:spacing w:after="100" w:line="280"/>
+      </w:pPr>
+      <w:r>
+        <w:t xml:space="preserve">Settings → System → Power: never sleep when plugged in.</w:t>
+      </w:r>
+    </w:p>
+    <w:p>
+      <w:pPr>
+        <w:pStyle w:val="ListParagraph"/>
+        <w:numPr>
+          <w:ilvl w:val="0"/>
+          <w:numId w:val="2"/>
+        </w:numPr>
+        <w:spacing w:after="100" w:line="280"/>
+      </w:pPr>
+      <w:r>
+        <w:t xml:space="preserve">Windows Pro: Settings → System → Remote Desktop → On, then from another PC run </w:t>
+      </w:r>
+      <w:r>
+        <w:rPr>
+          <w:rFonts w:ascii="Consolas" w:cs="Consolas" w:eastAsia="Consolas" w:hAnsi="Consolas"/>
+          <w:sz w:val="20"/>
+          <w:szCs w:val="20"/>
+        </w:rPr>
+        <w:t xml:space="preserve">mstsc</w:t>
+      </w:r>
+      <w:r>
+        <w:t xml:space="preserve"> and connect to the NINA PC's Tailscale name. Windows Home can't host Remote Desktop — use RustDesk instead.</w:t>
+      </w:r>
+    </w:p>
+    <w:p>
+      <w:pPr>
+        <w:pStyle w:val="Heading3"/>
+        <w:spacing w:after="100" w:before="220"/>
+      </w:pPr>
+      <w:r>
+        <w:rPr>
+          <w:b/>
+          <w:bCs/>
+          <w:color w:val="2F6F4E"/>
+        </w:rPr>
+        <w:t xml:space="preserve">Security</w:t>
+      </w:r>
+    </w:p>
+    <w:p>
+      <w:pPr>
+        <w:pStyle w:val="ListParagraph"/>
+        <w:numPr>
+          <w:ilvl w:val="0"/>
+          <w:numId w:val="2"/>
+        </w:numPr>
+        <w:spacing w:after="100" w:line="280"/>
+      </w:pPr>
+      <w:r>
+        <w:t xml:space="preserve">Turn on 2-Step Verification for the account you sign in to Tailscale with — that protects who can join your network.</w:t>
+      </w:r>
+    </w:p>
+    <w:p>
+      <w:pPr>
+        <w:pStyle w:val="ListParagraph"/>
+        <w:numPr>
+          <w:ilvl w:val="0"/>
+          <w:numId w:val="2"/>
+        </w:numPr>
+        <w:spacing w:after="100" w:line="280"/>
+      </w:pPr>
+      <w:r>
+        <w:t xml:space="preserve">Use a strong Windows password and keep Windows, NINA, Tailscale and the Pi updated. Don't enable Tailscale Funnel (it makes the address public).</w:t>
+      </w:r>
+    </w:p>
+    <w:p>
+      <w:pPr>
+        <w:pStyle w:val="Heading1"/>
+        <w:pBdr>
+          <w:bottom w:val="single" w:color="1F3A5F" w:sz="6" w:space="4"/>
+        </w:pBdr>
+        <w:spacing w:after="200" w:before="480"/>
+      </w:pPr>
+      <w:r>
+        <w:rPr>
+          <w:b/>
+          <w:bCs/>
+          <w:color w:val="1F3A5F"/>
+        </w:rPr>
+        <w:t xml:space="preserve">13. Protecting and Recovering Your Data</w:t>
+      </w:r>
+    </w:p>
+    <w:p>
+      <w:pPr>
+        <w:spacing w:after="160" w:line="300"/>
+      </w:pPr>
+      <w:r>
+        <w:t xml:space="preserve">Your sensor readings and labels are kept in several places, so losing one copy is never the end:</w:t>
+      </w:r>
+    </w:p>
+    <w:p>
+      <w:pPr>
+        <w:pStyle w:val="ListParagraph"/>
+        <w:numPr>
+          <w:ilvl w:val="0"/>
+          <w:numId w:val="2"/>
+        </w:numPr>
+        <w:spacing w:after="100" w:line="280"/>
+      </w:pPr>
+      <w:r>
+        <w:rPr>
+          <w:rFonts w:ascii="Consolas" w:cs="Consolas" w:eastAsia="Consolas" w:hAnsi="Consolas"/>
+          <w:sz w:val="20"/>
+          <w:szCs w:val="20"/>
+        </w:rPr>
+        <w:t xml:space="preserve">ai_training/index.json</w:t>
+      </w:r>
+      <w:r>
+        <w:t xml:space="preserve"> — the working list. Saves can't overlap, and a damaged file is set aside as </w:t>
+      </w:r>
+      <w:r>
+        <w:rPr>
+          <w:rFonts w:ascii="Consolas" w:cs="Consolas" w:eastAsia="Consolas" w:hAnsi="Consolas"/>
+          <w:sz w:val="20"/>
+          <w:szCs w:val="20"/>
+        </w:rPr>
+        <w:t xml:space="preserve">index.json.corrupt-&lt;time&gt;</w:t>
+      </w:r>
+      <w:r>
+        <w:t xml:space="preserve"> and saving pauses instead of starting over empty.</w:t>
+      </w:r>
+    </w:p>
+    <w:p>
+      <w:pPr>
+        <w:pStyle w:val="ListParagraph"/>
+        <w:numPr>
+          <w:ilvl w:val="0"/>
+          <w:numId w:val="2"/>
+        </w:numPr>
+        <w:spacing w:after="100" w:line="280"/>
+      </w:pPr>
+      <w:r>
+        <w:rPr>
+          <w:rFonts w:ascii="Consolas" w:cs="Consolas" w:eastAsia="Consolas" w:hAnsi="Consolas"/>
+          <w:sz w:val="20"/>
+          <w:szCs w:val="20"/>
+        </w:rPr>
+        <w:t xml:space="preserve">ai_training/sensor_log.jsonl</w:t>
+      </w:r>
+      <w:r>
+        <w:t xml:space="preserve"> — an </w:t>
+      </w:r>
+      <w:r>
+        <w:rPr>
+          <w:b/>
+          <w:bCs/>
+        </w:rPr>
+        <w:t xml:space="preserve">append-only</w:t>
+      </w:r>
+      <w:r>
+        <w:t xml:space="preserve"> record of every sample and every change. Nothing in the service ever deletes it, not even “Delete sensor records”.</w:t>
+      </w:r>
+    </w:p>
+    <w:p>
+      <w:pPr>
+        <w:pStyle w:val="ListParagraph"/>
+        <w:numPr>
+          <w:ilvl w:val="0"/>
+          <w:numId w:val="2"/>
+        </w:numPr>
+        <w:spacing w:after="100" w:line="280"/>
+      </w:pPr>
+      <w:r>
+        <w:rPr>
+          <w:rFonts w:ascii="Consolas" w:cs="Consolas" w:eastAsia="Consolas" w:hAnsi="Consolas"/>
+          <w:sz w:val="20"/>
+          <w:szCs w:val="20"/>
+        </w:rPr>
+        <w:t xml:space="preserve">ai_training/index_copies/</w:t>
+      </w:r>
+      <w:r>
+        <w:t xml:space="preserve"> — a copy of the list at each training run (last 7).</w:t>
+      </w:r>
+    </w:p>
+    <w:p>
+      <w:pPr>
+        <w:pStyle w:val="ListParagraph"/>
+        <w:numPr>
+          <w:ilvl w:val="0"/>
+          <w:numId w:val="2"/>
+        </w:numPr>
+        <w:spacing w:after="100" w:line="280"/>
+      </w:pPr>
+      <w:r>
+        <w:rPr>
+          <w:b/>
+          <w:bCs/>
+        </w:rPr>
+        <w:t xml:space="preserve">Each training image</w:t>
+      </w:r>
+      <w:r>
+        <w:t xml:space="preserve"> also carries its own sensor readings in its JPEG metadata.</w:t>
+      </w:r>
+    </w:p>
+    <w:p>
+      <w:pPr>
+        <w:pStyle w:val="ListParagraph"/>
+        <w:numPr>
+          <w:ilvl w:val="0"/>
+          <w:numId w:val="2"/>
+        </w:numPr>
+        <w:spacing w:after="100" w:line="280"/>
+      </w:pPr>
+      <w:r>
+        <w:rPr>
+          <w:b/>
+          <w:bCs/>
+        </w:rPr>
+        <w:t xml:space="preserve">Download sensor records (.zip)</w:t>
+      </w:r>
+      <w:r>
+        <w:t xml:space="preserve"> on the Classify page — keep one off the Pi regularly.</w:t>
+      </w:r>
+    </w:p>
+    <w:p>
+      <w:pPr>
+        <w:pStyle w:val="Heading3"/>
+        <w:spacing w:after="100" w:before="220"/>
+      </w:pPr>
+      <w:r>
+        <w:rPr>
+          <w:b/>
+          <w:bCs/>
+          <w:color w:val="2F6F4E"/>
+        </w:rPr>
+        <w:t xml:space="preserve">Recovering</w:t>
+      </w:r>
+    </w:p>
+    <w:p>
+      <w:pPr>
+        <w:spacing w:after="160" w:line="300"/>
+      </w:pPr>
+      <w:r>
+        <w:t xml:space="preserve">The Classify page shows a </w:t>
+      </w:r>
+      <w:r>
+        <w:rPr>
+          <w:b/>
+          <w:bCs/>
+        </w:rPr>
+        <w:t xml:space="preserve">Recovery</w:t>
+      </w:r>
+      <w:r>
+        <w:t xml:space="preserve"> card whenever something needs attention:</w:t>
+      </w:r>
+    </w:p>
+    <w:p>
+      <w:pPr>
+        <w:pStyle w:val="ListParagraph"/>
+        <w:numPr>
+          <w:ilvl w:val="0"/>
+          <w:numId w:val="2"/>
+        </w:numPr>
+        <w:spacing w:after="100" w:line="280"/>
+      </w:pPr>
+      <w:r>
+        <w:rPr>
+          <w:b/>
+          <w:bCs/>
+        </w:rPr>
+        <w:t xml:space="preserve">Restore training copy / Rebuild from sensor log</w:t>
+      </w:r>
+      <w:r>
+        <w:t xml:space="preserve"> — when the list file is damaged.</w:t>
+      </w:r>
+    </w:p>
+    <w:p>
+      <w:pPr>
+        <w:pStyle w:val="ListParagraph"/>
+        <w:numPr>
+          <w:ilvl w:val="0"/>
+          <w:numId w:val="2"/>
+        </w:numPr>
+        <w:spacing w:after="100" w:line="280"/>
+      </w:pPr>
+      <w:r>
+        <w:rPr>
+          <w:b/>
+          <w:bCs/>
+        </w:rPr>
+        <w:t xml:space="preserve">Restore N images to the list</w:t>
+      </w:r>
+      <w:r>
+        <w:t xml:space="preserve"> — images on disk that the list lost; their readings come back from the sensor log or the image's metadata.</w:t>
+      </w:r>
+    </w:p>
+    <w:p>
+      <w:pPr>
+        <w:pStyle w:val="ListParagraph"/>
+        <w:numPr>
+          <w:ilvl w:val="0"/>
+          <w:numId w:val="2"/>
+        </w:numPr>
+        <w:spacing w:after="100" w:line="280"/>
+      </w:pPr>
+      <w:r>
+        <w:rPr>
+          <w:b/>
+          <w:bCs/>
+        </w:rPr>
+        <w:t xml:space="preserve">Recover images from AllSky archive</w:t>
+      </w:r>
+      <w:r>
+        <w:t xml:space="preserve"> — samples whose picture is missing.</w:t>
+      </w:r>
+    </w:p>
+    <w:p>
+      <w:pPr>
+        <w:pStyle w:val="ListParagraph"/>
+        <w:numPr>
+          <w:ilvl w:val="0"/>
+          <w:numId w:val="2"/>
+        </w:numPr>
+        <w:spacing w:after="100" w:line="280"/>
+      </w:pPr>
+      <w:r>
+        <w:rPr>
+          <w:b/>
+          <w:bCs/>
+        </w:rPr>
+        <w:t xml:space="preserve">Upload sensor records (.zip or .json)</w:t>
+      </w:r>
+      <w:r>
+        <w:t xml:space="preserve"> — merges labels and readings back in, re-creating missing samples; nothing is removed.</w:t>
+      </w:r>
+    </w:p>
+    <w:p>
+      <w:pPr>
+        <w:pStyle w:val="Heading3"/>
+        <w:spacing w:after="100" w:before="220"/>
+      </w:pPr>
+      <w:r>
+        <w:rPr>
+          <w:b/>
+          <w:bCs/>
+          <w:color w:val="2F6F4E"/>
+        </w:rPr>
+        <w:t xml:space="preserve">Last resort: scan the SD card</w:t>
+      </w:r>
+    </w:p>
+    <w:p>
+      <w:pPr>
+        <w:spacing w:after="160" w:line="300"/>
+      </w:pPr>
+      <w:r>
+        <w:t xml:space="preserve">If every copy is gone, old copies of the list usually remain on the SD card until overwritten. Close the roof, stop writes, copy the repository's tools/recover_index.py into RAM (so nothing new is written to the card) and run it — it only reads the card:</w:t>
+      </w:r>
+    </w:p>
+    <w:p>
+      <w:pPr>
+        <w:shd w:fill="F2F3F5" w:val="clear"/>
+        <w:spacing w:after="0" w:before="120" w:line="264"/>
+        <w:ind w:left="260" w:right="260"/>
+      </w:pPr>
+      <w:r>
+        <w:rPr>
+          <w:rFonts w:ascii="Consolas" w:cs="Consolas" w:eastAsia="Consolas" w:hAnsi="Consolas"/>
+          <w:sz w:val="20"/>
+          <w:szCs w:val="20"/>
+        </w:rPr>
+        <w:t xml:space="preserve">sudo systemctl stop dome-safety.service</w:t>
+      </w:r>
+    </w:p>
+    <w:p>
+      <w:pPr>
+        <w:shd w:fill="F2F3F5" w:val="clear"/>
+        <w:spacing w:after="0" w:before="0" w:line="264"/>
+        <w:ind w:left="260" w:right="260"/>
+      </w:pPr>
+      <w:r>
+        <w:rPr>
+          <w:rFonts w:ascii="Consolas" w:cs="Consolas" w:eastAsia="Consolas" w:hAnsi="Consolas"/>
+          <w:sz w:val="20"/>
+          <w:szCs w:val="20"/>
+        </w:rPr>
+        <w:t xml:space="preserve">sudo systemctl stop allsky</w:t>
+      </w:r>
+    </w:p>
+    <w:p>
+      <w:pPr>
+        <w:shd w:fill="F2F3F5" w:val="clear"/>
+        <w:spacing w:after="0" w:before="0" w:line="264"/>
+        <w:ind w:left="260" w:right="260"/>
+      </w:pPr>
+      <w:r>
+        <w:rPr>
+          <w:rFonts w:ascii="Consolas" w:cs="Consolas" w:eastAsia="Consolas" w:hAnsi="Consolas"/>
+          <w:sz w:val="20"/>
+          <w:szCs w:val="20"/>
+        </w:rPr>
+        <w:t xml:space="preserve">cp tools/recover_index.py /dev/shm/</w:t>
+      </w:r>
+    </w:p>
+    <w:p>
+      <w:pPr>
+        <w:shd w:fill="F2F3F5" w:val="clear"/>
+        <w:spacing w:after="220" w:before="0" w:line="264"/>
+        <w:ind w:left="260" w:right="260"/>
+      </w:pPr>
+      <w:r>
+        <w:rPr>
+          <w:rFonts w:ascii="Consolas" w:cs="Consolas" w:eastAsia="Consolas" w:hAnsi="Consolas"/>
+          <w:sz w:val="20"/>
+          <w:szCs w:val="20"/>
+        </w:rPr>
+        <w:t xml:space="preserve">sudo python3 /dev/shm/recover_index.py "$(findmnt -no SOURCE /)" /dev/shm/recovered_samples.json</w:t>
+      </w:r>
+    </w:p>
+    <w:p>
+      <w:pPr>
+        <w:spacing w:after="160" w:line="300"/>
+      </w:pPr>
+      <w:r>
+        <w:t xml:space="preserve">On 17 Oct 2026 this recovered all 4,826 samples with their labels and sensor readings. Then upload </w:t>
+      </w:r>
+      <w:r>
+        <w:rPr>
+          <w:rFonts w:ascii="Consolas" w:cs="Consolas" w:eastAsia="Consolas" w:hAnsi="Consolas"/>
+          <w:sz w:val="20"/>
+          <w:szCs w:val="20"/>
+        </w:rPr>
+        <w:t xml:space="preserve">recovered_samples.json</w:t>
+      </w:r>
+      <w:r>
+        <w:t xml:space="preserve"> with Upload sensor records.</w:t>
       </w:r>
     </w:p>
     <w:p>
@@ -5057,6 +6804,150 @@
                 <w:sz w:val="20"/>
                 <w:szCs w:val="20"/>
               </w:rPr>
+              <w:t xml:space="preserve">Sensor log (never deleted)</w:t>
+            </w:r>
+          </w:p>
+        </w:tc>
+        <w:tc>
+          <w:tcPr>
+            <w:tcW w:type="dxa" w:w="6160"/>
+            <w:tcMar>
+              <w:top w:type="dxa" w:w="80"/>
+              <w:left w:type="dxa" w:w="120"/>
+              <w:bottom w:type="dxa" w:w="80"/>
+              <w:right w:type="dxa" w:w="120"/>
+            </w:tcMar>
+          </w:tcPr>
+          <w:p>
+            <w:r>
+              <w:rPr>
+                <w:b w:val="false"/>
+                <w:bCs w:val="false"/>
+                <w:color w:val="222222"/>
+                <w:sz w:val="20"/>
+                <w:szCs w:val="20"/>
+              </w:rPr>
+              <w:t xml:space="preserve">ai_training/sensor_log.jsonl — append-only record of every sample and change</w:t>
+            </w:r>
+          </w:p>
+        </w:tc>
+      </w:tr>
+      <w:tr>
+        <w:tc>
+          <w:tcPr>
+            <w:tcW w:type="dxa" w:w="3200"/>
+            <w:tcMar>
+              <w:top w:type="dxa" w:w="80"/>
+              <w:left w:type="dxa" w:w="120"/>
+              <w:bottom w:type="dxa" w:w="80"/>
+              <w:right w:type="dxa" w:w="120"/>
+            </w:tcMar>
+          </w:tcPr>
+          <w:p>
+            <w:r>
+              <w:rPr>
+                <w:b w:val="false"/>
+                <w:bCs w:val="false"/>
+                <w:color w:val="222222"/>
+                <w:sz w:val="20"/>
+                <w:szCs w:val="20"/>
+              </w:rPr>
+              <w:t xml:space="preserve">Training copies of the list</w:t>
+            </w:r>
+          </w:p>
+        </w:tc>
+        <w:tc>
+          <w:tcPr>
+            <w:tcW w:type="dxa" w:w="6160"/>
+            <w:tcMar>
+              <w:top w:type="dxa" w:w="80"/>
+              <w:left w:type="dxa" w:w="120"/>
+              <w:bottom w:type="dxa" w:w="80"/>
+              <w:right w:type="dxa" w:w="120"/>
+            </w:tcMar>
+          </w:tcPr>
+          <w:p>
+            <w:r>
+              <w:rPr>
+                <w:b w:val="false"/>
+                <w:bCs w:val="false"/>
+                <w:color w:val="222222"/>
+                <w:sz w:val="20"/>
+                <w:szCs w:val="20"/>
+              </w:rPr>
+              <w:t xml:space="preserve">ai_training/index_copies/ — copy of index.json at each training run (last 7)</w:t>
+            </w:r>
+          </w:p>
+        </w:tc>
+      </w:tr>
+      <w:tr>
+        <w:tc>
+          <w:tcPr>
+            <w:tcW w:type="dxa" w:w="3200"/>
+            <w:tcMar>
+              <w:top w:type="dxa" w:w="80"/>
+              <w:left w:type="dxa" w:w="120"/>
+              <w:bottom w:type="dxa" w:w="80"/>
+              <w:right w:type="dxa" w:w="120"/>
+            </w:tcMar>
+          </w:tcPr>
+          <w:p>
+            <w:r>
+              <w:rPr>
+                <w:b w:val="false"/>
+                <w:bCs w:val="false"/>
+                <w:color w:val="222222"/>
+                <w:sz w:val="20"/>
+                <w:szCs w:val="20"/>
+              </w:rPr>
+              <w:t xml:space="preserve">Remote Access settings</w:t>
+            </w:r>
+          </w:p>
+        </w:tc>
+        <w:tc>
+          <w:tcPr>
+            <w:tcW w:type="dxa" w:w="6160"/>
+            <w:tcMar>
+              <w:top w:type="dxa" w:w="80"/>
+              <w:left w:type="dxa" w:w="120"/>
+              <w:bottom w:type="dxa" w:w="80"/>
+              <w:right w:type="dxa" w:w="120"/>
+            </w:tcMar>
+          </w:tcPr>
+          <w:p>
+            <w:r>
+              <w:rPr>
+                <w:b w:val="false"/>
+                <w:bCs w:val="false"/>
+                <w:color w:val="222222"/>
+                <w:sz w:val="20"/>
+                <w:szCs w:val="20"/>
+              </w:rPr>
+              <w:t xml:space="preserve">dome_config.json → remote_access (password stored only as a scrypt hash)</w:t>
+            </w:r>
+          </w:p>
+        </w:tc>
+      </w:tr>
+      <w:tr>
+        <w:tc>
+          <w:tcPr>
+            <w:tcW w:type="dxa" w:w="3200"/>
+            <w:tcMar>
+              <w:top w:type="dxa" w:w="80"/>
+              <w:left w:type="dxa" w:w="120"/>
+              <w:bottom w:type="dxa" w:w="80"/>
+              <w:right w:type="dxa" w:w="120"/>
+            </w:tcMar>
+          </w:tcPr>
+          <w:p>
+            <w:r>
+              <w:rPr>
+                <w:b w:val="false"/>
+                <w:bCs w:val="false"/>
+                <w:color w:val="222222"/>
+                <w:sz w:val="20"/>
+                <w:szCs w:val="20"/>
+              </w:rPr>
               <w:t xml:space="preserve">Cloud-trained image model</w:t>
             </w:r>
           </w:p>

</xml_diff>

<commit_message>
the cloud graph fix the Classify page list the Day/Night filter the docs update
</commit_message>
<xml_diff>
--- a/docs/Observatory_Setup_Guide.docx
+++ b/docs/Observatory_Setup_Guide.docx
@@ -3070,6 +3070,21 @@
       </w:r>
     </w:p>
     <w:p>
+      <w:pPr>
+        <w:spacing w:after="160" w:line="300"/>
+      </w:pPr>
+      <w:r>
+        <w:rPr>
+          <w:b/>
+          <w:bCs/>
+        </w:rPr>
+        <w:t xml:space="preserve">AI Cloud Detect line:</w:t>
+      </w:r>
+      <w:r>
+        <w:t xml:space="preserve"> the camera's answer picks the band — Clear in Clear; Partly or Mostly Cloudy in Cloudy; Overcast, Rain, Freezing Rain or Snow in Overcast — and its confidence picks the spot inside that band (100% = deepest; less sure = toward the next band). The line never leaves the band of the answer, so a less-sure Clear stays in Clear. Hover shows the confidence, e.g. “Clear (55%)”.</w:t>
+      </w:r>
+    </w:p>
+    <w:p>
       <w:r>
         <w:br w:type="page"/>
       </w:r>
@@ -3657,6 +3672,294 @@
     </w:p>
     <w:p>
       <w:pPr>
+        <w:pStyle w:val="Heading3"/>
+        <w:spacing w:after="100" w:before="220"/>
+      </w:pPr>
+      <w:r>
+        <w:rPr>
+          <w:b/>
+          <w:bCs/>
+          <w:color w:val="2F6F4E"/>
+        </w:rPr>
+        <w:t xml:space="preserve">How Safety Checks is laid out</w:t>
+      </w:r>
+    </w:p>
+    <w:p>
+      <w:pPr>
+        <w:spacing w:after="160" w:line="300"/>
+      </w:pPr>
+      <w:r>
+        <w:t xml:space="preserve">Related settings sit together in labelled blocks, with one </w:t>
+      </w:r>
+      <w:r>
+        <w:rPr>
+          <w:b/>
+          <w:bCs/>
+        </w:rPr>
+        <w:t xml:space="preserve">Save checks</w:t>
+      </w:r>
+      <w:r>
+        <w:t xml:space="preserve"> button at the bottom:</w:t>
+      </w:r>
+    </w:p>
+    <w:p>
+      <w:pPr>
+        <w:pStyle w:val="ListParagraph"/>
+        <w:numPr>
+          <w:ilvl w:val="0"/>
+          <w:numId w:val="2"/>
+        </w:numPr>
+        <w:spacing w:after="100" w:line="280"/>
+      </w:pPr>
+      <w:r>
+        <w:rPr>
+          <w:b/>
+          <w:bCs/>
+        </w:rPr>
+        <w:t xml:space="preserve">🌙 Day / Night</w:t>
+      </w:r>
+      <w:r>
+        <w:t xml:space="preserve"> — the check and the night threshold.</w:t>
+      </w:r>
+    </w:p>
+    <w:p>
+      <w:pPr>
+        <w:pStyle w:val="ListParagraph"/>
+        <w:numPr>
+          <w:ilvl w:val="0"/>
+          <w:numId w:val="2"/>
+        </w:numPr>
+        <w:spacing w:after="100" w:line="280"/>
+      </w:pPr>
+      <w:r>
+        <w:rPr>
+          <w:b/>
+          <w:bCs/>
+        </w:rPr>
+        <w:t xml:space="preserve">🌡️ Sky sensor (MLX90614)</w:t>
+      </w:r>
+      <w:r>
+        <w:t xml:space="preserve"> — clear-sky check, delta threshold, ambient source.</w:t>
+      </w:r>
+    </w:p>
+    <w:p>
+      <w:pPr>
+        <w:pStyle w:val="ListParagraph"/>
+        <w:numPr>
+          <w:ilvl w:val="0"/>
+          <w:numId w:val="2"/>
+        </w:numPr>
+        <w:spacing w:after="100" w:line="280"/>
+      </w:pPr>
+      <w:r>
+        <w:rPr>
+          <w:b/>
+          <w:bCs/>
+        </w:rPr>
+        <w:t xml:space="preserve">🤖 AI Sky Prediction (Sensor Based)</w:t>
+      </w:r>
+      <w:r>
+        <w:t xml:space="preserve"> — AI Model check, Steadier, Model per period, Ignore short sky jumps, Combine with AI Cloud Detect. Greyed out (values kept) while the MLX90614 is turned off under Hardware Pins.</w:t>
+      </w:r>
+    </w:p>
+    <w:p>
+      <w:pPr>
+        <w:pStyle w:val="ListParagraph"/>
+        <w:numPr>
+          <w:ilvl w:val="0"/>
+          <w:numId w:val="2"/>
+        </w:numPr>
+        <w:spacing w:after="100" w:line="280"/>
+      </w:pPr>
+      <w:r>
+        <w:rPr>
+          <w:b/>
+          <w:bCs/>
+        </w:rPr>
+        <w:t xml:space="preserve">📷 AI Cloud Detect (All Sky)</w:t>
+      </w:r>
+      <w:r>
+        <w:t xml:space="preserve">, </w:t>
+      </w:r>
+      <w:r>
+        <w:rPr>
+          <w:b/>
+          <w:bCs/>
+        </w:rPr>
+        <w:t xml:space="preserve">📷 Simple Cloud Detect</w:t>
+      </w:r>
+      <w:r>
+        <w:t xml:space="preserve">, </w:t>
+      </w:r>
+      <w:r>
+        <w:rPr>
+          <w:b/>
+          <w:bCs/>
+        </w:rPr>
+        <w:t xml:space="preserve">💦 Dew risk</w:t>
+      </w:r>
+      <w:r>
+        <w:t xml:space="preserve">, </w:t>
+      </w:r>
+      <w:r>
+        <w:rPr>
+          <w:b/>
+          <w:bCs/>
+        </w:rPr>
+        <w:t xml:space="preserve">⏳ Reporting SAFE</w:t>
+      </w:r>
+      <w:r>
+        <w:t xml:space="preserve"> (hold delay) and </w:t>
+      </w:r>
+      <w:r>
+        <w:rPr>
+          <w:b/>
+          <w:bCs/>
+        </w:rPr>
+        <w:t xml:space="preserve">📈 Graph</w:t>
+      </w:r>
+      <w:r>
+        <w:t xml:space="preserve"> (AI graph style).</w:t>
+      </w:r>
+    </w:p>
+    <w:p>
+      <w:pPr>
+        <w:pStyle w:val="Heading3"/>
+        <w:spacing w:after="100" w:before="220"/>
+      </w:pPr>
+      <w:r>
+        <w:rPr>
+          <w:b/>
+          <w:bCs/>
+          <w:color w:val="2F6F4E"/>
+        </w:rPr>
+        <w:t xml:space="preserve">Confidence %</w:t>
+      </w:r>
+    </w:p>
+    <w:p>
+      <w:pPr>
+        <w:spacing w:after="160" w:line="300"/>
+      </w:pPr>
+      <w:r>
+        <w:t xml:space="preserve">AI Sky Prediction shows how sure it is, like AI Cloud Detect — e.g. </w:t>
+      </w:r>
+      <w:r>
+        <w:rPr>
+          <w:b/>
+          <w:bCs/>
+        </w:rPr>
+        <w:t xml:space="preserve">Clear (72%)</w:t>
+      </w:r>
+      <w:r>
+        <w:t xml:space="preserve">. It is worked out at each training from how often readings at that value were really that class. Press </w:t>
+      </w:r>
+      <w:r>
+        <w:rPr>
+          <w:b/>
+          <w:bCs/>
+        </w:rPr>
+        <w:t xml:space="preserve">Train model now</w:t>
+      </w:r>
+      <w:r>
+        <w:t xml:space="preserve"> once after updating to get it.</w:t>
+      </w:r>
+    </w:p>
+    <w:p>
+      <w:pPr>
+        <w:pStyle w:val="Heading3"/>
+        <w:spacing w:after="100" w:before="220"/>
+      </w:pPr>
+      <w:r>
+        <w:rPr>
+          <w:b/>
+          <w:bCs/>
+          <w:color w:val="2F6F4E"/>
+        </w:rPr>
+        <w:t xml:space="preserve">Ignore short sky jumps (spike filter)</w:t>
+      </w:r>
+    </w:p>
+    <w:p>
+      <w:pPr>
+        <w:spacing w:after="160" w:line="300"/>
+      </w:pPr>
+      <w:r>
+        <w:t xml:space="preserve">Off by default. A sky reading that jumps more than </w:t>
+      </w:r>
+      <w:r>
+        <w:rPr>
+          <w:b/>
+          <w:bCs/>
+        </w:rPr>
+        <w:t xml:space="preserve">Jump bigger than</w:t>
+      </w:r>
+      <w:r>
+        <w:t xml:space="preserve"> (default 5 °C) from the recent readings is ignored until it has lasted </w:t>
+      </w:r>
+      <w:r>
+        <w:rPr>
+          <w:b/>
+          <w:bCs/>
+        </w:rPr>
+        <w:t xml:space="preserve">Must last</w:t>
+      </w:r>
+      <w:r>
+        <w:t xml:space="preserve"> minutes (default 2) — then it is accepted (real cloud stays). It feeds both AI Sky Prediction and the MLX sky check. Real cloud is reported up to that many minutes later. The raw readings are still shown, saved and used for training. The dashboard tag “sky jump ignored” shows while a jump is being held.</w:t>
+      </w:r>
+    </w:p>
+    <w:p>
+      <w:pPr>
+        <w:pStyle w:val="Heading3"/>
+        <w:spacing w:after="100" w:before="220"/>
+      </w:pPr>
+      <w:r>
+        <w:rPr>
+          <w:b/>
+          <w:bCs/>
+          <w:color w:val="2F6F4E"/>
+        </w:rPr>
+        <w:t xml:space="preserve">Combine with AI Cloud Detect (camera)</w:t>
+      </w:r>
+    </w:p>
+    <w:p>
+      <w:pPr>
+        <w:spacing w:after="160" w:line="300"/>
+      </w:pPr>
+      <w:r>
+        <w:t xml:space="preserve">Off by default; needs a downloaded AI Cloud Detect model. When AI Sky Prediction's confidence is below </w:t>
+      </w:r>
+      <w:r>
+        <w:rPr>
+          <w:b/>
+          <w:bCs/>
+        </w:rPr>
+        <w:t xml:space="preserve">Camera decides when the sensor is less sure than</w:t>
+      </w:r>
+      <w:r>
+        <w:t xml:space="preserve"> (default 75%), the camera's answer is used: Clear → </w:t>
+      </w:r>
+      <w:r>
+        <w:rPr>
+          <w:b/>
+          <w:bCs/>
+        </w:rPr>
+        <w:t xml:space="preserve">Clear</w:t>
+      </w:r>
+      <w:r>
+        <w:t xml:space="preserve">, any cloud → </w:t>
+      </w:r>
+      <w:r>
+        <w:rPr>
+          <w:b/>
+          <w:bCs/>
+        </w:rPr>
+        <w:t xml:space="preserve">Cloudy</w:t>
+      </w:r>
+      <w:r>
+        <w:t xml:space="preserve">. At or above it, the sensor decides. Camera on Ignore or no current frame = sensor decides. The dashboard tag “camera decided” shows when it happens.</w:t>
+      </w:r>
+    </w:p>
+    <w:p>
+      <w:pPr>
         <w:pStyle w:val="Heading2"/>
         <w:spacing w:after="140" w:before="340"/>
       </w:pPr>
@@ -3737,6 +4040,28 @@
           <w:szCs w:val="19"/>
         </w:rPr>
         <w:t xml:space="preserve">Figure 7 — Dome &amp; Heater switches, and the All Sky Camera section.</w:t>
+      </w:r>
+    </w:p>
+    <w:p>
+      <w:pPr>
+        <w:pStyle w:val="Heading3"/>
+        <w:spacing w:after="100" w:before="220"/>
+      </w:pPr>
+      <w:r>
+        <w:rPr>
+          <w:b/>
+          <w:bCs/>
+          <w:color w:val="2F6F4E"/>
+        </w:rPr>
+        <w:t xml:space="preserve">Dome after a restart</w:t>
+      </w:r>
+    </w:p>
+    <w:p>
+      <w:pPr>
+        <w:spacing w:after="160" w:line="300"/>
+      </w:pPr>
+      <w:r>
+        <w:t xml:space="preserve">The dome state is saved like the safety state. After a restart within 1 minute the last state (Open / Closed) is shown straight away while the reed switch is read again — no false FAULT at startup. If the roof moved while the service was down, the Event Log says “Dome position changed during restart”. Stopped for more than 1 minute: the dome reads its position fresh.</w:t>
       </w:r>
     </w:p>
     <w:p>
@@ -5818,6 +6143,76 @@
     </w:p>
     <w:p>
       <w:pPr>
+        <w:pStyle w:val="ListParagraph"/>
+        <w:numPr>
+          <w:ilvl w:val="0"/>
+          <w:numId w:val="2"/>
+        </w:numPr>
+        <w:spacing w:after="100" w:line="280"/>
+      </w:pPr>
+      <w:r>
+        <w:rPr>
+          <w:b/>
+          <w:bCs/>
+        </w:rPr>
+        <w:t xml:space="preserve">Page list:</w:t>
+      </w:r>
+      <w:r>
+        <w:t xml:space="preserve"> above and below the grid — “Showing 49–72 of 1,502 images · Page 3 of 63” with ‹ Prev, page numbers and Next ›. Totals follow the filter and update straight away after you label, relabel or delete. Prev / Next never skip images; a number jumps to that page.</w:t>
+      </w:r>
+    </w:p>
+    <w:p>
+      <w:pPr>
+        <w:pStyle w:val="ListParagraph"/>
+        <w:numPr>
+          <w:ilvl w:val="0"/>
+          <w:numId w:val="2"/>
+        </w:numPr>
+        <w:spacing w:after="100" w:line="280"/>
+      </w:pPr>
+      <w:r>
+        <w:rPr>
+          <w:b/>
+          <w:bCs/>
+        </w:rPr>
+        <w:t xml:space="preserve">Day / Night filter:</w:t>
+      </w:r>
+      <w:r>
+        <w:t xml:space="preserve"> the second dropdown — </w:t>
+      </w:r>
+      <w:r>
+        <w:rPr>
+          <w:b/>
+          <w:bCs/>
+        </w:rPr>
+        <w:t xml:space="preserve">--</w:t>
+      </w:r>
+      <w:r>
+        <w:t xml:space="preserve"> (both, default), </w:t>
+      </w:r>
+      <w:r>
+        <w:rPr>
+          <w:b/>
+          <w:bCs/>
+        </w:rPr>
+        <w:t xml:space="preserve">Day</w:t>
+      </w:r>
+      <w:r>
+        <w:t xml:space="preserve"> or </w:t>
+      </w:r>
+      <w:r>
+        <w:rPr>
+          <w:b/>
+          <w:bCs/>
+        </w:rPr>
+        <w:t xml:space="preserve">Night</w:t>
+      </w:r>
+      <w:r>
+        <w:t xml:space="preserve"> — works together with the first filter (e.g. Clear + Night) and is kept on every page, One by one and Select ALL. Images with no Day/Night saved show only under --.</w:t>
+      </w:r>
+    </w:p>
+    <w:p>
+      <w:pPr>
         <w:pStyle w:val="Heading3"/>
         <w:spacing w:after="100" w:before="220"/>
       </w:pPr>
@@ -6269,6 +6664,112 @@
       </w:r>
       <w:r>
         <w:t xml:space="preserve">; if you can see haze (dimmer stars, halos), label them Partly Cloudy.</w:t>
+      </w:r>
+    </w:p>
+    <w:p>
+      <w:pPr>
+        <w:pStyle w:val="Heading3"/>
+        <w:spacing w:after="100" w:before="220"/>
+      </w:pPr>
+      <w:r>
+        <w:rPr>
+          <w:b/>
+          <w:bCs/>
+          <w:color w:val="2F6F4E"/>
+        </w:rPr>
+        <w:t xml:space="preserve">Cloud training fails with “jpeg::Uncompress failed”</w:t>
+      </w:r>
+    </w:p>
+    <w:p>
+      <w:pPr>
+        <w:spacing w:after="160" w:line="300"/>
+      </w:pPr>
+      <w:r>
+        <w:t xml:space="preserve">One image on the Pi is damaged (usually cut short while it was being saved), and one bad image stops the whole run. Find it (the file name is the date and time, e.g. 20261022_071848 = 22 Oct 07:18:48), filter Classify to its label, delete it, and train again.</w:t>
+      </w:r>
+    </w:p>
+    <w:p>
+      <w:pPr>
+        <w:pStyle w:val="Heading3"/>
+        <w:spacing w:after="100" w:before="220"/>
+      </w:pPr>
+      <w:r>
+        <w:rPr>
+          <w:b/>
+          <w:bCs/>
+          <w:color w:val="2F6F4E"/>
+        </w:rPr>
+        <w:t xml:space="preserve">AI Cloud Detect dips when a neighbour's light comes on</w:t>
+      </w:r>
+    </w:p>
+    <w:p>
+      <w:pPr>
+        <w:spacing w:after="160" w:line="300"/>
+      </w:pPr>
+      <w:r>
+        <w:t xml:space="preserve">Label every frame by the </w:t>
+      </w:r>
+      <w:r>
+        <w:rPr>
+          <w:b/>
+          <w:bCs/>
+        </w:rPr>
+        <w:t xml:space="preserve">sky only</w:t>
+      </w:r>
+      <w:r>
+        <w:t xml:space="preserve"> — Clear if the sky is clear, a cloud class if there is cloud — even with the light on. Keep Ignore only for frames you can't judge. Mixed labels for the same light-on sky make the model unsure. Then train; </w:t>
+      </w:r>
+      <w:r>
+        <w:rPr>
+          <w:b/>
+          <w:bCs/>
+        </w:rPr>
+        <w:t xml:space="preserve">Reset cloud model</w:t>
+      </w:r>
+      <w:r>
+        <w:t xml:space="preserve"> first if you want every image sent again, not just new ones.</w:t>
+      </w:r>
+    </w:p>
+    <w:p>
+      <w:pPr>
+        <w:pStyle w:val="Heading3"/>
+        <w:spacing w:after="100" w:before="220"/>
+      </w:pPr>
+      <w:r>
+        <w:rPr>
+          <w:b/>
+          <w:bCs/>
+          <w:color w:val="2F6F4E"/>
+        </w:rPr>
+        <w:t xml:space="preserve">Images uploaded from a zip don't show on Classify</w:t>
+      </w:r>
+    </w:p>
+    <w:p>
+      <w:pPr>
+        <w:spacing w:after="160" w:line="300"/>
+      </w:pPr>
+      <w:r>
+        <w:t xml:space="preserve">Restored images keep their labels, so they don't appear under </w:t>
+      </w:r>
+      <w:r>
+        <w:rPr>
+          <w:b/>
+          <w:bCs/>
+        </w:rPr>
+        <w:t xml:space="preserve">Unclassified only</w:t>
+      </w:r>
+      <w:r>
+        <w:t xml:space="preserve"> (the default filter). Choose </w:t>
+      </w:r>
+      <w:r>
+        <w:rPr>
+          <w:b/>
+          <w:bCs/>
+        </w:rPr>
+        <w:t xml:space="preserve">All samples</w:t>
+      </w:r>
+      <w:r>
+        <w:t xml:space="preserve"> or a label. The upload message says how many were restored and skipped.</w:t>
       </w:r>
     </w:p>
     <w:p>

</xml_diff>

<commit_message>
added new feature to set schedule for the safety. fixed some ui changes
</commit_message>
<xml_diff>
--- a/docs/Observatory_Setup_Guide.docx
+++ b/docs/Observatory_Setup_Guide.docx
@@ -2735,6 +2735,71 @@
     </w:p>
     <w:p>
       <w:pPr>
+        <w:spacing w:after="160" w:line="300"/>
+      </w:pPr>
+      <w:r>
+        <w:rPr>
+          <w:b/>
+          <w:bCs/>
+        </w:rPr>
+        <w:t xml:space="preserve">Automatic one-time action:</w:t>
+      </w:r>
+      <w:r>
+        <w:t xml:space="preserve"> the row under the three buttons — ☐ </w:t>
+      </w:r>
+      <w:r>
+        <w:rPr>
+          <w:b/>
+          <w:bCs/>
+        </w:rPr>
+        <w:t xml:space="preserve">Enable automatic</w:t>
+      </w:r>
+      <w:r>
+        <w:t xml:space="preserve">, an action (</w:t>
+      </w:r>
+      <w:r>
+        <w:rPr>
+          <w:b/>
+          <w:bCs/>
+        </w:rPr>
+        <w:t xml:space="preserve">Force SAFE</w:t>
+      </w:r>
+      <w:r>
+        <w:t xml:space="preserve">, </w:t>
+      </w:r>
+      <w:r>
+        <w:rPr>
+          <w:b/>
+          <w:bCs/>
+        </w:rPr>
+        <w:t xml:space="preserve">Force UNSAFE</w:t>
+      </w:r>
+      <w:r>
+        <w:t xml:space="preserve"> or </w:t>
+      </w:r>
+      <w:r>
+        <w:rPr>
+          <w:b/>
+          <w:bCs/>
+        </w:rPr>
+        <w:t xml:space="preserve">Back to Auto</w:t>
+      </w:r>
+      <w:r>
+        <w:t xml:space="preserve">, default Back to Auto), a time and </w:t>
+      </w:r>
+      <w:r>
+        <w:rPr>
+          <w:b/>
+          <w:bCs/>
+        </w:rPr>
+        <w:t xml:space="preserve">Save</w:t>
+      </w:r>
+      <w:r>
+        <w:t xml:space="preserve"> — runs that action once at that time, exactly like clicking its button, then unticks itself (like the dome's automatic OPEN/CLOSE). Tick it again to arm it for another day. The action is logged; the ⓘ explains it. On a phone the row stays on one line, with the label hidden.</w:t>
+      </w:r>
+    </w:p>
+    <w:p>
+      <w:pPr>
         <w:spacing w:after="60" w:before="120"/>
         <w:jc w:val="center"/>
       </w:pPr>

</xml_diff>